<commit_message>
Scope terug naar taalcorrectie: spelling + grammatica/stijl
Juridische checks (defined terms, kruisverwijzingen) verwijderd — definedTerms.ts
geschrapt. Twee check-lagen over: offline nspell-spelling en een algemene NL/EN
LLM-proeflezer (grammatica + stijl).

- server: prompt herschreven naar bilinguale proeflezer; deterministische sampling
  (temperature 0 + seed) voor stabiele herscans
- legalStyle: per-paragraaf sessie-cache, alleen gewijzigde paragrafen naar het model
- runChecks: dedup + locatability-backstop voor LLM-issues
- types/UI/theme: severity teruggebracht tot spelling + advisory
- demo: showcase-document (beide lagen in 1 doc) + antwoordsleutels bijgewerkt

Co-Authored-By: Claude Opus 4.8 <noreply@anthropic.com>
</commit_message>
<xml_diff>
--- a/demo/demo-contract.docx
+++ b/demo/demo-contract.docx
@@ -157,6 +157,58 @@
       </w:pPr>
       <w:r>
         <w:t xml:space="preserve">Each Party shall fulfill its oblgations under this Agreement in good faith.</w:t>
+      </w:r>
+    </w:p>
+    <w:p>
+      <w:pPr>
+        <w:pStyle w:val="Heading2"/>
+        <w:spacing w:after="120" w:before="240"/>
+      </w:pPr>
+      <w:r>
+        <w:t xml:space="preserve">Artikel 4 — Overige bepalingen</w:t>
+      </w:r>
+    </w:p>
+    <w:p>
+      <w:pPr>
+        <w:spacing w:after="160" w:line="276"/>
+        <w:jc w:val="both"/>
+      </w:pPr>
+      <w:r>
+        <w:t xml:space="preserve">De verplichtingen uit Artikel 7 blijven na afloop van deze overeenkomst van kracht.</w:t>
+      </w:r>
+    </w:p>
+    <w:p>
+      <w:pPr>
+        <w:spacing w:after="160" w:line="276"/>
+        <w:jc w:val="both"/>
+      </w:pPr>
+      <w:r>
+        <w:rPr>
+          <w:b/>
+          <w:bCs/>
+        </w:rPr>
+        <w:t xml:space="preserve">Overmacht</w:t>
+      </w:r>
+      <w:r>
+        <w:t xml:space="preserve"> betekent een gebeurtenis buiten de redelijke controle van een Partij.</w:t>
+      </w:r>
+    </w:p>
+    <w:p>
+      <w:pPr>
+        <w:spacing w:after="160" w:line="276"/>
+        <w:jc w:val="both"/>
+      </w:pPr>
+      <w:r>
+        <w:t xml:space="preserve">Partijen kunnen de Onderliggende Overeenkomst alleen schriftelijk wijzigen.</w:t>
+      </w:r>
+    </w:p>
+    <w:p>
+      <w:pPr>
+        <w:spacing w:after="160" w:line="276"/>
+        <w:jc w:val="both"/>
+      </w:pPr>
+      <w:r>
+        <w:t xml:space="preserve">De Onderliggende Overeenkomst gaat voor op alle eerdere mondelinge afspraken.</w:t>
       </w:r>
     </w:p>
     <w:sectPr>

</xml_diff>